<commit_message>
Figma: design system rules (tokens, typography, components, layout, naming, frame index) and the generator of the app-screen wireframes; BA document links the Figma file for the new requirements NR-A and NR-B
Co-Authored-By: Claude Sonnet 5.5 <noreply@anthropic.com>
Claude-Session: https://claude.ai/code/session_01Bjoj9kNHaBJ7Zd78F1MCBY
</commit_message>
<xml_diff>
--- a/docs/central-deposit-business-analysis.docx
+++ b/docs/central-deposit-business-analysis.docx
@@ -2,7 +2,7 @@
 <file path=word/document.xml><?xml version="1.0" encoding="utf-8"?>
 <w:document xmlns:w="http://schemas.openxmlformats.org/wordprocessingml/2006/main" xmlns:m="http://schemas.openxmlformats.org/officeDocument/2006/math" xmlns:r="http://schemas.openxmlformats.org/officeDocument/2006/relationships" xmlns:o="urn:schemas-microsoft-com:office:office" xmlns:v="urn:schemas-microsoft-com:vml" xmlns:w10="urn:schemas-microsoft-com:office:word" xmlns:a="http://schemas.openxmlformats.org/drawingml/2006/main" xmlns:pic="http://schemas.openxmlformats.org/drawingml/2006/picture" xmlns:wp="http://schemas.openxmlformats.org/drawingml/2006/wordprocessingDrawing">
   <w:body>
-    <w:bookmarkStart w:id="108" w:name="Xeb68af8c01aead9767e5d9285b12437adc92924"/>
+    <w:bookmarkStart w:id="109" w:name="Xeb68af8c01aead9767e5d9285b12437adc92924"/>
     <w:p>
       <w:pPr>
         <w:pStyle w:val="Heading1"/>
@@ -7208,7 +7208,7 @@
     </w:tbl>
     <w:bookmarkEnd w:id="58"/>
     <w:bookmarkEnd w:id="59"/>
-    <w:bookmarkStart w:id="63" w:name="X278f059a73e67134b314b2afbb0874e915500a1"/>
+    <w:bookmarkStart w:id="64" w:name="X278f059a73e67134b314b2afbb0874e915500a1"/>
     <w:p>
       <w:pPr>
         <w:pStyle w:val="Heading2"/>
@@ -7764,8 +7764,264 @@
         <w:t xml:space="preserve">Figure 5. Screens and navigation</w:t>
       </w:r>
     </w:p>
+    <w:bookmarkStart w:id="63" w:name="wireframes-and-design-system-in-figma"/>
+    <w:p>
+      <w:pPr>
+        <w:pStyle w:val="Heading3"/>
+      </w:pPr>
+      <w:r>
+        <w:t xml:space="preserve">8.1 Wireframes and design system in Figma</w:t>
+      </w:r>
+    </w:p>
+    <w:p>
+      <w:pPr>
+        <w:pStyle w:val="FirstParagraph"/>
+      </w:pPr>
+      <w:r>
+        <w:t xml:space="preserve">All 15 screens of the baseline, in their role and production-type variants (28 frames), and the four screens of the new requirements are in the Figma file</w:t>
+      </w:r>
+      <w:r>
+        <w:t xml:space="preserve"> </w:t>
+      </w:r>
+      <w:r>
+        <w:rPr>
+          <w:bCs/>
+          <w:b/>
+        </w:rPr>
+        <w:t xml:space="preserve">AV Central Deposit - App Screens</w:t>
+      </w:r>
+      <w:r>
+        <w:t xml:space="preserve"> </w:t>
+      </w:r>
+      <w:r>
+        <w:t xml:space="preserve">(https://www.figma.com/design/VMPaCaMP1CetCL9RdQRuZD): page</w:t>
+      </w:r>
+      <w:r>
+        <w:t xml:space="preserve"> </w:t>
+      </w:r>
+      <w:r>
+        <w:rPr>
+          <w:rStyle w:val="VerbatimChar"/>
+        </w:rPr>
+        <w:t xml:space="preserve">Screens</w:t>
+      </w:r>
+      <w:r>
+        <w:t xml:space="preserve"> </w:t>
+      </w:r>
+      <w:r>
+        <w:t xml:space="preserve">(32 frames), page</w:t>
+      </w:r>
+      <w:r>
+        <w:t xml:space="preserve"> </w:t>
+      </w:r>
+      <w:r>
+        <w:rPr>
+          <w:rStyle w:val="VerbatimChar"/>
+        </w:rPr>
+        <w:t xml:space="preserve">Components</w:t>
+      </w:r>
+      <w:r>
+        <w:t xml:space="preserve"> </w:t>
+      </w:r>
+      <w:r>
+        <w:t xml:space="preserve">(Button, Input, Checkbox, Status badge), page</w:t>
+      </w:r>
+      <w:r>
+        <w:t xml:space="preserve"> </w:t>
+      </w:r>
+      <w:r>
+        <w:rPr>
+          <w:rStyle w:val="VerbatimChar"/>
+        </w:rPr>
+        <w:t xml:space="preserve">Foundations</w:t>
+      </w:r>
+      <w:r>
+        <w:t xml:space="preserve"> </w:t>
+      </w:r>
+      <w:r>
+        <w:t xml:space="preserve">(tokens, type scale). The design system rules, the token table, the mapping of components to Power Apps controls and the frame index are in</w:t>
+      </w:r>
+      <w:r>
+        <w:t xml:space="preserve"> </w:t>
+      </w:r>
+      <w:r>
+        <w:rPr>
+          <w:rStyle w:val="VerbatimChar"/>
+        </w:rPr>
+        <w:t xml:space="preserve">docs/figma-design-system-rules.md</w:t>
+      </w:r>
+      <w:r>
+        <w:t xml:space="preserve">.</w:t>
+      </w:r>
+    </w:p>
+    <w:tbl>
+      <w:tblPr>
+        <w:tblStyle w:val="Table"/>
+        <w:tblW w:type="pct" w:w="5000"/>
+        <w:tblLook w:firstRow="1" w:lastRow="0" w:firstColumn="0" w:lastColumn="0" w:noHBand="0" w:noVBand="0" w:val="0020"/>
+        <w:jc w:val="start"/>
+      </w:tblPr>
+      <w:tblGrid>
+        <w:gridCol w:w="4910"/>
+        <w:gridCol w:w="3009"/>
+      </w:tblGrid>
+      <w:tr>
+        <w:trPr>
+          <w:tblHeader w:val="true"/>
+        </w:trPr>
+        <w:tc>
+          <w:tcPr/>
+          <w:p>
+            <w:pPr>
+              <w:pStyle w:val="Compact"/>
+              <w:jc w:val="left"/>
+            </w:pPr>
+            <w:r>
+              <w:t xml:space="preserve">New screen (frame)</w:t>
+            </w:r>
+          </w:p>
+        </w:tc>
+        <w:tc>
+          <w:tcPr/>
+          <w:p>
+            <w:pPr>
+              <w:pStyle w:val="Compact"/>
+              <w:jc w:val="left"/>
+            </w:pPr>
+            <w:r>
+              <w:t xml:space="preserve">Requirement</w:t>
+            </w:r>
+          </w:p>
+        </w:tc>
+      </w:tr>
+      <w:tr>
+        <w:tc>
+          <w:tcPr/>
+          <w:p>
+            <w:pPr>
+              <w:pStyle w:val="Compact"/>
+              <w:jc w:val="left"/>
+            </w:pPr>
+            <w:r>
+              <w:rPr>
+                <w:rStyle w:val="VerbatimChar"/>
+              </w:rPr>
+              <w:t xml:space="preserve">ImportFormScreen / NR-A upload (administrator)</w:t>
+            </w:r>
+          </w:p>
+        </w:tc>
+        <w:tc>
+          <w:tcPr/>
+          <w:p>
+            <w:pPr>
+              <w:pStyle w:val="Compact"/>
+              <w:jc w:val="left"/>
+            </w:pPr>
+            <w:r>
+              <w:t xml:space="preserve">NR-A IMP-01 to IMP-05, IMP-09</w:t>
+            </w:r>
+          </w:p>
+        </w:tc>
+      </w:tr>
+      <w:tr>
+        <w:tc>
+          <w:tcPr/>
+          <w:p>
+            <w:pPr>
+              <w:pStyle w:val="Compact"/>
+              <w:jc w:val="left"/>
+            </w:pPr>
+            <w:r>
+              <w:rPr>
+                <w:rStyle w:val="VerbatimChar"/>
+              </w:rPr>
+              <w:t xml:space="preserve">ImportFormScreen / NR-A preview and attachment check</w:t>
+            </w:r>
+          </w:p>
+        </w:tc>
+        <w:tc>
+          <w:tcPr/>
+          <w:p>
+            <w:pPr>
+              <w:pStyle w:val="Compact"/>
+              <w:jc w:val="left"/>
+            </w:pPr>
+            <w:r>
+              <w:t xml:space="preserve">NR-A IMP-07, IMP-08 and NR-B ATT-03 to ATT-06</w:t>
+            </w:r>
+          </w:p>
+        </w:tc>
+      </w:tr>
+      <w:tr>
+        <w:tc>
+          <w:tcPr/>
+          <w:p>
+            <w:pPr>
+              <w:pStyle w:val="Compact"/>
+              <w:jc w:val="left"/>
+            </w:pPr>
+            <w:r>
+              <w:rPr>
+                <w:rStyle w:val="VerbatimChar"/>
+              </w:rPr>
+              <w:t xml:space="preserve">ChildValidScreen / NR-B attachment rules (proposed)</w:t>
+            </w:r>
+          </w:p>
+        </w:tc>
+        <w:tc>
+          <w:tcPr/>
+          <w:p>
+            <w:pPr>
+              <w:pStyle w:val="Compact"/>
+              <w:jc w:val="left"/>
+            </w:pPr>
+            <w:r>
+              <w:t xml:space="preserve">NR-B ATT-03 to ATT-09</w:t>
+            </w:r>
+          </w:p>
+        </w:tc>
+      </w:tr>
+      <w:tr>
+        <w:tc>
+          <w:tcPr/>
+          <w:p>
+            <w:pPr>
+              <w:pStyle w:val="Compact"/>
+              <w:jc w:val="left"/>
+            </w:pPr>
+            <w:r>
+              <w:rPr>
+                <w:rStyle w:val="VerbatimChar"/>
+              </w:rPr>
+              <w:t xml:space="preserve">ChildLegalScreen / NR-B file-name hint and classification (proposed)</w:t>
+            </w:r>
+          </w:p>
+        </w:tc>
+        <w:tc>
+          <w:tcPr/>
+          <w:p>
+            <w:pPr>
+              <w:pStyle w:val="Compact"/>
+              <w:jc w:val="left"/>
+            </w:pPr>
+            <w:r>
+              <w:t xml:space="preserve">NR-B ATT-01, ATT-07, ATT-10</w:t>
+            </w:r>
+          </w:p>
+        </w:tc>
+      </w:tr>
+    </w:tbl>
+    <w:p>
+      <w:pPr>
+        <w:pStyle w:val="BodyText"/>
+      </w:pPr>
+      <w:r>
+        <w:t xml:space="preserve">The wireframes are generated from the app source and are not a pixel-perfect capture; the limits are listed in section 9 of the design rules.</w:t>
+      </w:r>
+    </w:p>
     <w:bookmarkEnd w:id="63"/>
-    <w:bookmarkStart w:id="67" w:name="data-model"/>
+    <w:bookmarkEnd w:id="64"/>
+    <w:bookmarkStart w:id="68" w:name="data-model"/>
     <w:p>
       <w:pPr>
         <w:pStyle w:val="Heading2"/>
@@ -7783,18 +8039,18 @@
           <wp:inline>
             <wp:extent cx="4906799" cy="7559999"/>
             <wp:effectExtent b="0" l="0" r="0" t="0"/>
-            <wp:docPr descr="Figure 6. Data model" title="" id="65" name="Picture"/>
+            <wp:docPr descr="Figure 6. Data model" title="" id="66" name="Picture"/>
             <a:graphic>
               <a:graphicData uri="http://schemas.openxmlformats.org/drawingml/2006/picture">
                 <pic:pic>
                   <pic:nvPicPr>
-                    <pic:cNvPr descr="/home/user/PowerApps_AJF/docs/ba-diagrams/06-data-model.png" id="66" name="Picture"/>
+                    <pic:cNvPr descr="/home/user/PowerApps_AJF/docs/ba-diagrams/06-data-model.png" id="67" name="Picture"/>
                     <pic:cNvPicPr>
                       <a:picLocks noChangeArrowheads="1" noChangeAspect="1"/>
                     </pic:cNvPicPr>
                   </pic:nvPicPr>
                   <pic:blipFill>
-                    <a:blip r:embed="rId64"/>
+                    <a:blip r:embed="rId65"/>
                     <a:stretch>
                       <a:fillRect/>
                     </a:stretch>
@@ -8022,8 +8278,8 @@
         <w:t xml:space="preserve">if the lists grow beyond 5,000 items.</w:t>
       </w:r>
     </w:p>
-    <w:bookmarkEnd w:id="67"/>
-    <w:bookmarkStart w:id="76" w:name="X3fc0480ff2e516425486b5bc23e55f20a626e8a"/>
+    <w:bookmarkEnd w:id="68"/>
+    <w:bookmarkStart w:id="77" w:name="X3fc0480ff2e516425486b5bc23e55f20a626e8a"/>
     <w:p>
       <w:pPr>
         <w:pStyle w:val="Heading2"/>
@@ -8032,7 +8288,7 @@
         <w:t xml:space="preserve">10. New requirement NR-A: upload the production form as a Draft request</w:t>
       </w:r>
     </w:p>
-    <w:bookmarkStart w:id="68" w:name="business-need-and-current-state"/>
+    <w:bookmarkStart w:id="69" w:name="business-need-and-current-state"/>
     <w:p>
       <w:pPr>
         <w:pStyle w:val="Heading3"/>
@@ -8126,8 +8382,8 @@
         <w:t xml:space="preserve">, so it is specified here as a requirement to (re)introduce. The Word templates need one fix: the video form's "Subtitles provided" boxes are old symbol boxes and must be replaced by Word check-box content controls.</w:t>
       </w:r>
     </w:p>
-    <w:bookmarkEnd w:id="68"/>
-    <w:bookmarkStart w:id="72" w:name="process"/>
+    <w:bookmarkEnd w:id="69"/>
+    <w:bookmarkStart w:id="73" w:name="process"/>
     <w:p>
       <w:pPr>
         <w:pStyle w:val="Heading3"/>
@@ -8145,18 +8401,18 @@
           <wp:inline>
             <wp:extent cx="2447999" cy="7559999"/>
             <wp:effectExtent b="0" l="0" r="0" t="0"/>
-            <wp:docPr descr="Figure 7. Form upload process (NR-A)" title="" id="70" name="Picture"/>
+            <wp:docPr descr="Figure 7. Form upload process (NR-A)" title="" id="71" name="Picture"/>
             <a:graphic>
               <a:graphicData uri="http://schemas.openxmlformats.org/drawingml/2006/picture">
                 <pic:pic>
                   <pic:nvPicPr>
-                    <pic:cNvPr descr="/home/user/PowerApps_AJF/docs/ba-diagrams/07-nra-form-upload.png" id="71" name="Picture"/>
+                    <pic:cNvPr descr="/home/user/PowerApps_AJF/docs/ba-diagrams/07-nra-form-upload.png" id="72" name="Picture"/>
                     <pic:cNvPicPr>
                       <a:picLocks noChangeArrowheads="1" noChangeAspect="1"/>
                     </pic:cNvPicPr>
                   </pic:nvPicPr>
                   <pic:blipFill>
-                    <a:blip r:embed="rId69"/>
+                    <a:blip r:embed="rId70"/>
                     <a:stretch>
                       <a:fillRect/>
                     </a:stretch>
@@ -8191,8 +8447,8 @@
         <w:t xml:space="preserve">Figure 7. Form upload process (NR-A)</w:t>
       </w:r>
     </w:p>
-    <w:bookmarkEnd w:id="72"/>
-    <w:bookmarkStart w:id="73" w:name="requirements"/>
+    <w:bookmarkEnd w:id="73"/>
+    <w:bookmarkStart w:id="74" w:name="requirements"/>
     <w:p>
       <w:pPr>
         <w:pStyle w:val="Heading3"/>
@@ -9023,8 +9279,8 @@
         <w:t xml:space="preserve">.</w:t>
       </w:r>
     </w:p>
-    <w:bookmarkEnd w:id="73"/>
-    <w:bookmarkStart w:id="74" w:name="acceptance-criteria-examples"/>
+    <w:bookmarkEnd w:id="74"/>
+    <w:bookmarkStart w:id="75" w:name="acceptance-criteria-examples"/>
     <w:p>
       <w:pPr>
         <w:pStyle w:val="Heading3"/>
@@ -9275,8 +9531,8 @@
         </w:tc>
       </w:tr>
     </w:tbl>
-    <w:bookmarkEnd w:id="74"/>
-    <w:bookmarkStart w:id="75" w:name="risks-and-open-points"/>
+    <w:bookmarkEnd w:id="75"/>
+    <w:bookmarkStart w:id="76" w:name="risks-and-open-points"/>
     <w:p>
       <w:pPr>
         <w:pStyle w:val="Heading3"/>
@@ -9324,9 +9580,9 @@
         <w:t xml:space="preserve">is not kept on the media file because it would count as a legal annex (OQ-08).</w:t>
       </w:r>
     </w:p>
-    <w:bookmarkEnd w:id="75"/>
     <w:bookmarkEnd w:id="76"/>
-    <w:bookmarkStart w:id="88" w:name="X96abde6f38e039fc7b618fa3e2b1ba9eb7b8114"/>
+    <w:bookmarkEnd w:id="77"/>
+    <w:bookmarkStart w:id="89" w:name="X96abde6f38e039fc7b618fa3e2b1ba9eb7b8114"/>
     <w:p>
       <w:pPr>
         <w:pStyle w:val="Heading2"/>
@@ -9335,7 +9591,7 @@
         <w:t xml:space="preserve">11. New requirement NR-B: validate attachments by file name and by the ticked check boxes</w:t>
       </w:r>
     </w:p>
-    <w:bookmarkStart w:id="77" w:name="business-need"/>
+    <w:bookmarkStart w:id="78" w:name="business-need"/>
     <w:p>
       <w:pPr>
         <w:pStyle w:val="Heading3"/>
@@ -9405,8 +9661,8 @@
         <w:t xml:space="preserve">, so that an administrator can see at a glance that the dossier is complete, and the requestor is told exactly what is missing or misnamed before submitting.</w:t>
       </w:r>
     </w:p>
-    <w:bookmarkEnd w:id="77"/>
-    <w:bookmarkStart w:id="78" w:name="concept"/>
+    <w:bookmarkEnd w:id="78"/>
+    <w:bookmarkStart w:id="79" w:name="concept"/>
     <w:p>
       <w:pPr>
         <w:pStyle w:val="Heading3"/>
@@ -9652,8 +9908,8 @@
         <w:t xml:space="preserve">), not in formulas, so the AV Library can change a token or a requirement without a new version of the app.</w:t>
       </w:r>
     </w:p>
-    <w:bookmarkEnd w:id="78"/>
-    <w:bookmarkStart w:id="79" w:name="X4e146b1dee2f305fe674375386f6837319f8ccc"/>
+    <w:bookmarkEnd w:id="79"/>
+    <w:bookmarkStart w:id="80" w:name="X4e146b1dee2f305fe674375386f6837319f8ccc"/>
     <w:p>
       <w:pPr>
         <w:pStyle w:val="Heading3"/>
@@ -10881,8 +11137,8 @@
         </w:tc>
       </w:tr>
     </w:tbl>
-    <w:bookmarkEnd w:id="79"/>
-    <w:bookmarkStart w:id="80" w:name="requirements-1"/>
+    <w:bookmarkEnd w:id="80"/>
+    <w:bookmarkStart w:id="81" w:name="requirements-1"/>
     <w:p>
       <w:pPr>
         <w:pStyle w:val="Heading3"/>
@@ -11717,8 +11973,8 @@
         </w:tc>
       </w:tr>
     </w:tbl>
-    <w:bookmarkEnd w:id="80"/>
-    <w:bookmarkStart w:id="84" w:name="validation-algorithm"/>
+    <w:bookmarkEnd w:id="81"/>
+    <w:bookmarkStart w:id="85" w:name="validation-algorithm"/>
     <w:p>
       <w:pPr>
         <w:pStyle w:val="Heading3"/>
@@ -11736,18 +11992,18 @@
           <wp:inline>
             <wp:extent cx="4795199" cy="7559999"/>
             <wp:effectExtent b="0" l="0" r="0" t="0"/>
-            <wp:docPr descr="Figure 8. Attachment validation algorithm (NR-B)" title="" id="82" name="Picture"/>
+            <wp:docPr descr="Figure 8. Attachment validation algorithm (NR-B)" title="" id="83" name="Picture"/>
             <a:graphic>
               <a:graphicData uri="http://schemas.openxmlformats.org/drawingml/2006/picture">
                 <pic:pic>
                   <pic:nvPicPr>
-                    <pic:cNvPr descr="/home/user/PowerApps_AJF/docs/ba-diagrams/08-nrb-validation-algorithm.png" id="83" name="Picture"/>
+                    <pic:cNvPr descr="/home/user/PowerApps_AJF/docs/ba-diagrams/08-nrb-validation-algorithm.png" id="84" name="Picture"/>
                     <pic:cNvPicPr>
                       <a:picLocks noChangeArrowheads="1" noChangeAspect="1"/>
                     </pic:cNvPicPr>
                   </pic:nvPicPr>
                   <pic:blipFill>
-                    <a:blip r:embed="rId81"/>
+                    <a:blip r:embed="rId82"/>
                     <a:stretch>
                       <a:fillRect/>
                     </a:stretch>
@@ -11782,8 +12038,8 @@
         <w:t xml:space="preserve">Figure 8. Attachment validation algorithm (NR-B)</w:t>
       </w:r>
     </w:p>
-    <w:bookmarkEnd w:id="84"/>
-    <w:bookmarkStart w:id="85" w:name="examples"/>
+    <w:bookmarkEnd w:id="85"/>
+    <w:bookmarkStart w:id="86" w:name="examples"/>
     <w:p>
       <w:pPr>
         <w:pStyle w:val="Heading3"/>
@@ -12193,8 +12449,8 @@
         </w:tc>
       </w:tr>
     </w:tbl>
-    <w:bookmarkEnd w:id="85"/>
-    <w:bookmarkStart w:id="86" w:name="acceptance-criteria-examples-1"/>
+    <w:bookmarkEnd w:id="86"/>
+    <w:bookmarkStart w:id="87" w:name="acceptance-criteria-examples-1"/>
     <w:p>
       <w:pPr>
         <w:pStyle w:val="Heading3"/>
@@ -12478,8 +12734,8 @@
         </w:tc>
       </w:tr>
     </w:tbl>
-    <w:bookmarkEnd w:id="86"/>
-    <w:bookmarkStart w:id="87" w:name="risks"/>
+    <w:bookmarkEnd w:id="87"/>
+    <w:bookmarkStart w:id="88" w:name="risks"/>
     <w:p>
       <w:pPr>
         <w:pStyle w:val="Heading3"/>
@@ -12512,9 +12768,9 @@
         <w:t xml:space="preserve">helper later); renaming a file after upload is not possible in a SharePoint attachment control (the user deletes and re-attaches); the rules for cases 2 to 6 are proposals until the contract officers confirm them; the token list must be agreed once and published in the Help screen and in the e-mails.</w:t>
       </w:r>
     </w:p>
-    <w:bookmarkEnd w:id="87"/>
     <w:bookmarkEnd w:id="88"/>
-    <w:bookmarkStart w:id="89" w:name="sharepoint-prerequisites"/>
+    <w:bookmarkEnd w:id="89"/>
+    <w:bookmarkStart w:id="90" w:name="sharepoint-prerequisites"/>
     <w:p>
       <w:pPr>
         <w:pStyle w:val="Heading2"/>
@@ -12885,8 +13141,8 @@
         </w:tc>
       </w:tr>
     </w:tbl>
-    <w:bookmarkEnd w:id="89"/>
-    <w:bookmarkStart w:id="90" w:name="notifications-and-flows"/>
+    <w:bookmarkEnd w:id="90"/>
+    <w:bookmarkStart w:id="91" w:name="notifications-and-flows"/>
     <w:p>
       <w:pPr>
         <w:pStyle w:val="Heading2"/>
@@ -13554,8 +13810,8 @@
         <w:t xml:space="preserve">and are switched on for week 2 of the test phase.</w:t>
       </w:r>
     </w:p>
-    <w:bookmarkEnd w:id="90"/>
-    <w:bookmarkStart w:id="91" w:name="reporting-and-kpis"/>
+    <w:bookmarkEnd w:id="91"/>
+    <w:bookmarkStart w:id="92" w:name="reporting-and-kpis"/>
     <w:p>
       <w:pPr>
         <w:pStyle w:val="Heading2"/>
@@ -13861,8 +14117,8 @@
         <w:t xml:space="preserve">Dashboards show these counts with the refresh icon and a "last updated" time; the KPI dashboard hides the average-time card for requestors.</w:t>
       </w:r>
     </w:p>
-    <w:bookmarkEnd w:id="91"/>
-    <w:bookmarkStart w:id="92" w:name="non-functional-requirements"/>
+    <w:bookmarkEnd w:id="92"/>
+    <w:bookmarkStart w:id="93" w:name="non-functional-requirements"/>
     <w:p>
       <w:pPr>
         <w:pStyle w:val="Heading2"/>
@@ -14279,8 +14535,8 @@
         </w:tc>
       </w:tr>
     </w:tbl>
-    <w:bookmarkEnd w:id="92"/>
-    <w:bookmarkStart w:id="93" w:name="X01abfcd41ed807aa9f2156acd0889759f66373b"/>
+    <w:bookmarkEnd w:id="93"/>
+    <w:bookmarkStart w:id="94" w:name="X01abfcd41ed807aa9f2156acd0889759f66373b"/>
     <w:p>
       <w:pPr>
         <w:pStyle w:val="Heading2"/>
@@ -14312,8 +14568,8 @@
         <w:t xml:space="preserve">(NR-A); dashboards and printing/export; audit trail. The reference build uses Power Apps, SharePoint, Power Automate, Office 365 Users and Office 365 Outlook, plus OneDrive for Business for the form import.</w:t>
       </w:r>
     </w:p>
-    <w:bookmarkEnd w:id="93"/>
-    <w:bookmarkStart w:id="97" w:name="Xacf6d8526a4846fad7b8776146d73ec742e2613"/>
+    <w:bookmarkEnd w:id="94"/>
+    <w:bookmarkStart w:id="98" w:name="Xacf6d8526a4846fad7b8776146d73ec742e2613"/>
     <w:p>
       <w:pPr>
         <w:pStyle w:val="Heading2"/>
@@ -14322,7 +14578,7 @@
         <w:t xml:space="preserve">17. Assumptions, constraints, dependencies and risks</w:t>
       </w:r>
     </w:p>
-    <w:bookmarkStart w:id="94" w:name="assumptions"/>
+    <w:bookmarkStart w:id="95" w:name="assumptions"/>
     <w:p>
       <w:pPr>
         <w:pStyle w:val="Heading3"/>
@@ -14354,8 +14610,8 @@
         <w:t xml:space="preserve">is the home of the data; the support mailbox exists and can be used as the sender.</w:t>
       </w:r>
     </w:p>
-    <w:bookmarkEnd w:id="94"/>
-    <w:bookmarkStart w:id="95" w:name="constraints"/>
+    <w:bookmarkEnd w:id="95"/>
+    <w:bookmarkStart w:id="96" w:name="constraints"/>
     <w:p>
       <w:pPr>
         <w:pStyle w:val="Heading3"/>
@@ -14372,8 +14628,8 @@
         <w:t xml:space="preserve">Canvas app limits (controls per screen, delegation, 2000-row data limit); SharePoint list attachment handling (no rename in place); no Beluga integration; flows are imported off.</w:t>
       </w:r>
     </w:p>
-    <w:bookmarkEnd w:id="95"/>
-    <w:bookmarkStart w:id="96" w:name="risks-1"/>
+    <w:bookmarkEnd w:id="96"/>
+    <w:bookmarkStart w:id="97" w:name="risks-1"/>
     <w:p>
       <w:pPr>
         <w:pStyle w:val="Heading3"/>
@@ -14958,9 +15214,9 @@
         </w:tc>
       </w:tr>
     </w:tbl>
-    <w:bookmarkEnd w:id="96"/>
     <w:bookmarkEnd w:id="97"/>
-    <w:bookmarkStart w:id="101" w:name="implementation-approach"/>
+    <w:bookmarkEnd w:id="98"/>
+    <w:bookmarkStart w:id="102" w:name="implementation-approach"/>
     <w:p>
       <w:pPr>
         <w:pStyle w:val="Heading2"/>
@@ -14978,18 +15234,18 @@
           <wp:inline>
             <wp:extent cx="5334000" cy="2149763"/>
             <wp:effectExtent b="0" l="0" r="0" t="0"/>
-            <wp:docPr descr="Figure 9. Indicative plan" title="" id="99" name="Picture"/>
+            <wp:docPr descr="Figure 9. Indicative plan" title="" id="100" name="Picture"/>
             <a:graphic>
               <a:graphicData uri="http://schemas.openxmlformats.org/drawingml/2006/picture">
                 <pic:pic>
                   <pic:nvPicPr>
-                    <pic:cNvPr descr="/home/user/PowerApps_AJF/docs/ba-diagrams/09-implementation-plan.png" id="100" name="Picture"/>
+                    <pic:cNvPr descr="/home/user/PowerApps_AJF/docs/ba-diagrams/09-implementation-plan.png" id="101" name="Picture"/>
                     <pic:cNvPicPr>
                       <a:picLocks noChangeArrowheads="1" noChangeAspect="1"/>
                     </pic:cNvPicPr>
                   </pic:nvPicPr>
                   <pic:blipFill>
-                    <a:blip r:embed="rId98"/>
+                    <a:blip r:embed="rId99"/>
                     <a:stretch>
                       <a:fillRect/>
                     </a:stretch>
@@ -15050,8 +15306,8 @@
         <w:t xml:space="preserve">Communicate the new channel and the date after which e-mailed forms are no longer processed; name two champions per DG; collect feedback through the support mailbox; review the KPIs after four weeks.</w:t>
       </w:r>
     </w:p>
-    <w:bookmarkEnd w:id="101"/>
-    <w:bookmarkStart w:id="102" w:name="test-strategy-and-acceptance"/>
+    <w:bookmarkEnd w:id="102"/>
+    <w:bookmarkStart w:id="103" w:name="test-strategy-and-acceptance"/>
     <w:p>
       <w:pPr>
         <w:pStyle w:val="Heading2"/>
@@ -15196,8 +15452,8 @@
         <w:t xml:space="preserve">every cell of the coverage matrix passed at least once; every e-mail of the table received by the right recipients with a working link; no blocking defect open; the support mailbox receives its copies; the KPIs can be read from the dashboards; the approvers sign the document.</w:t>
       </w:r>
     </w:p>
-    <w:bookmarkEnd w:id="102"/>
-    <w:bookmarkStart w:id="103" w:name="traceability-matrix"/>
+    <w:bookmarkEnd w:id="103"/>
+    <w:bookmarkStart w:id="104" w:name="traceability-matrix"/>
     <w:p>
       <w:pPr>
         <w:pStyle w:val="Heading2"/>
@@ -15752,8 +16008,28 @@
         </w:tc>
       </w:tr>
     </w:tbl>
-    <w:bookmarkEnd w:id="103"/>
-    <w:bookmarkStart w:id="104" w:name="open-questions-and-decisions-needed"/>
+    <w:p>
+      <w:pPr>
+        <w:pStyle w:val="BodyText"/>
+      </w:pPr>
+      <w:r>
+        <w:t xml:space="preserve">Design: every row above has a frame in the Figma file (section 8.1); the frame index is in</w:t>
+      </w:r>
+      <w:r>
+        <w:t xml:space="preserve"> </w:t>
+      </w:r>
+      <w:r>
+        <w:rPr>
+          <w:rStyle w:val="VerbatimChar"/>
+        </w:rPr>
+        <w:t xml:space="preserve">docs/figma-design-system-rules.md</w:t>
+      </w:r>
+      <w:r>
+        <w:t xml:space="preserve">.</w:t>
+      </w:r>
+    </w:p>
+    <w:bookmarkEnd w:id="104"/>
+    <w:bookmarkStart w:id="105" w:name="open-questions-and-decisions-needed"/>
     <w:p>
       <w:pPr>
         <w:pStyle w:val="Heading2"/>
@@ -16265,8 +16541,8 @@
         </w:tc>
       </w:tr>
     </w:tbl>
-    <w:bookmarkEnd w:id="104"/>
-    <w:bookmarkStart w:id="105" w:name="glossary"/>
+    <w:bookmarkEnd w:id="105"/>
+    <w:bookmarkStart w:id="106" w:name="glossary"/>
     <w:p>
       <w:pPr>
         <w:pStyle w:val="Heading2"/>
@@ -16576,8 +16852,8 @@
         </w:tc>
       </w:tr>
     </w:tbl>
-    <w:bookmarkEnd w:id="105"/>
-    <w:bookmarkStart w:id="106" w:name="Xa0078e1dd46b06d6364b196bb9960666bd8d804"/>
+    <w:bookmarkEnd w:id="106"/>
+    <w:bookmarkStart w:id="107" w:name="Xa0078e1dd46b06d6364b196bb9960666bd8d804"/>
     <w:p>
       <w:pPr>
         <w:pStyle w:val="Heading2"/>
@@ -17732,8 +18008,8 @@
         <w:t xml:space="preserve">: media type set; title provided; capture date set; language (video, podcast); no AI-generated voice-over; contract case selected; case 1 contracts confirmed; at least one legal annex; type-specific mandatory fields above; podcast and episode visuals JPEG or PNG; no SRT subtitles; publication end not before start; production end not before filming date; music licence confirmed when music is declared; owner / point of contact set on the request.</w:t>
       </w:r>
     </w:p>
-    <w:bookmarkEnd w:id="106"/>
-    <w:bookmarkStart w:id="107" w:name="appendix-b.-source-documents"/>
+    <w:bookmarkEnd w:id="107"/>
+    <w:bookmarkStart w:id="108" w:name="appendix-b.-source-documents"/>
     <w:p>
       <w:pPr>
         <w:pStyle w:val="Heading2"/>
@@ -17750,8 +18026,8 @@
         <w:jc w:val="start"/>
       </w:tblPr>
       <w:tblGrid>
-        <w:gridCol w:w="3247"/>
-        <w:gridCol w:w="4672"/>
+        <w:gridCol w:w="3326"/>
+        <w:gridCol w:w="4593"/>
       </w:tblGrid>
       <w:tr>
         <w:trPr>
@@ -17881,6 +18157,64 @@
               <w:rPr>
                 <w:rStyle w:val="VerbatimChar"/>
               </w:rPr>
+              <w:t xml:space="preserve">docs/figma-design-system-rules.md</w:t>
+            </w:r>
+          </w:p>
+        </w:tc>
+        <w:tc>
+          <w:tcPr/>
+          <w:p>
+            <w:pPr>
+              <w:pStyle w:val="Compact"/>
+              <w:jc w:val="left"/>
+            </w:pPr>
+            <w:r>
+              <w:t xml:space="preserve">Figma file, tokens, components, layout and naming rules, frame index</w:t>
+            </w:r>
+          </w:p>
+        </w:tc>
+      </w:tr>
+      <w:tr>
+        <w:tc>
+          <w:tcPr/>
+          <w:p>
+            <w:pPr>
+              <w:pStyle w:val="Compact"/>
+              <w:jc w:val="left"/>
+            </w:pPr>
+            <w:r>
+              <w:rPr>
+                <w:rStyle w:val="VerbatimChar"/>
+              </w:rPr>
+              <w:t xml:space="preserve">tools/figma/</w:t>
+            </w:r>
+          </w:p>
+        </w:tc>
+        <w:tc>
+          <w:tcPr/>
+          <w:p>
+            <w:pPr>
+              <w:pStyle w:val="Compact"/>
+              <w:jc w:val="left"/>
+            </w:pPr>
+            <w:r>
+              <w:t xml:space="preserve">Generator of the Figma wireframes from the app source</w:t>
+            </w:r>
+          </w:p>
+        </w:tc>
+      </w:tr>
+      <w:tr>
+        <w:tc>
+          <w:tcPr/>
+          <w:p>
+            <w:pPr>
+              <w:pStyle w:val="Compact"/>
+              <w:jc w:val="left"/>
+            </w:pPr>
+            <w:r>
+              <w:rPr>
+                <w:rStyle w:val="VerbatimChar"/>
+              </w:rPr>
               <w:t xml:space="preserve">docs/TEST-file-findings.md</w:t>
             </w:r>
           </w:p>
@@ -17957,8 +18291,8 @@
         </w:tc>
       </w:tr>
     </w:tbl>
-    <w:bookmarkEnd w:id="107"/>
     <w:bookmarkEnd w:id="108"/>
+    <w:bookmarkEnd w:id="109"/>
     <w:sectPr>
       <w:pgSz w:w="11906" w:h="16838"/>
       <w:pgMar w:top="900" w:right="900" w:bottom="900" w:left="900" w:header="400" w:footer="400" w:gutter="0"/>

</xml_diff>